<commit_message>
modify lab 001 guide
</commit_message>
<xml_diff>
--- a/jnciesproadmap/LAB-001/LAB-001_SOLUTION-GUIDE-v2.docx
+++ b/jnciesproadmap/LAB-001/LAB-001_SOLUTION-GUIDE-v2.docx
@@ -2051,7 +2051,12 @@
               <w:pBdr/>
               <w:spacing w:after="0" w:before="0" w:line="240" w:lineRule="auto"/>
               <w:ind/>
-              <w:rPr/>
+              <w:rPr>
+                <w:rFonts w:ascii="Liberation Mono" w:hAnsi="Liberation Mono"/>
+                <w:color w:val="24292e"/>
+                <w:sz w:val="16"/>
+                <w:szCs w:val="16"/>
+              </w:rPr>
             </w:pPr>
             <w:r>
               <w:rPr>
@@ -2070,10 +2075,23 @@
                 <w:color w:val="24292e"/>
                 <w:sz w:val="16"/>
               </w:rPr>
-              <w:t xml:space="preserve">set policy-options policy-statement LAB001-TEST term 10 from prefix-list LAB001-PREFIXES</w:t>
+              <w:t xml:space="preserve">set policy-options policy-statement POLTEST term 10 from prefix-list MYPREFIX</w:t>
             </w:r>
+            <w:r/>
+          </w:p>
+          <w:p>
+            <w:pPr>
+              <w:pBdr/>
+              <w:spacing w:after="0" w:before="0" w:line="240" w:lineRule="auto"/>
+              <w:ind/>
+              <w:rPr/>
+            </w:pPr>
             <w:r>
-              <w:br/>
+              <w:rPr>
+                <w:rFonts w:ascii="Liberation Mono" w:hAnsi="Liberation Mono"/>
+                <w:color w:val="24292e"/>
+                <w:sz w:val="16"/>
+              </w:rPr>
             </w:r>
             <w:r>
               <w:rPr>
@@ -2081,7 +2099,7 @@
                 <w:color w:val="24292e"/>
                 <w:sz w:val="16"/>
               </w:rPr>
-              <w:t xml:space="preserve">set policy-options policy-statement LAB001-TEST term 10 then accept</w:t>
+              <w:t xml:space="preserve">set policy-options policy-statement POLTEST term 10 then accept</w:t>
             </w:r>
             <w:r>
               <w:br/>
@@ -2094,6 +2112,7 @@
               </w:rPr>
               <w:t xml:space="preserve">commit check</w:t>
             </w:r>
+            <w:r/>
             <w:r/>
           </w:p>
         </w:tc>
@@ -2215,7 +2234,24 @@
                 <w:color w:val="24292e"/>
                 <w:sz w:val="16"/>
               </w:rPr>
-              <w:t xml:space="preserve">set policy-options prefix-list LAB001-PREFIXES 192.0.2.0/24</w:t>
+              <w:t xml:space="preserve">set policy-options prefix-list </w:t>
+            </w:r>
+            <w:r>
+              <w:rPr>
+                <w:rFonts w:ascii="Liberation Mono" w:hAnsi="Liberation Mono"/>
+                <w:color w:val="24292e"/>
+                <w:sz w:val="16"/>
+              </w:rPr>
+              <w:t xml:space="preserve">MYPREFIX</w:t>
+            </w:r>
+            <w:r/>
+            <w:r>
+              <w:rPr>
+                <w:rFonts w:ascii="Liberation Mono" w:hAnsi="Liberation Mono"/>
+                <w:color w:val="24292e"/>
+                <w:sz w:val="16"/>
+              </w:rPr>
+              <w:t xml:space="preserve"> 192.0.2.0/24</w:t>
             </w:r>
             <w:r>
               <w:br/>
@@ -2546,7 +2582,7 @@
                 <w:color w:val="24292e"/>
                 <w:sz w:val="16"/>
               </w:rPr>
-              <w:t xml:space="preserve">set system location rack RACK-01</w:t>
+              <w:t xml:space="preserve">set system location rack 99</w:t>
             </w:r>
             <w:r>
               <w:br/>
@@ -3029,7 +3065,6 @@
       <w:r>
         <w:t xml:space="preserve">Record pre-change evidence.</w:t>
       </w:r>
-      <w:r/>
       <w:r/>
     </w:p>
     <w:p>

</xml_diff>